<commit_message>
updated admin panel - home page
</commit_message>
<xml_diff>
--- a/DOCS/DIAGRAMS/DATA DICTIONARY.docx
+++ b/DOCS/DIAGRAMS/DATA DICTIONARY.docx
@@ -2935,11 +2935,132 @@
       </w:pPr>
     </w:p>
     <w:p>
+      <w:pPr>
+        <w:rPr>
+          <w:b/>
+          <w:bCs/>
+        </w:rPr>
+      </w:pPr>
+    </w:p>
+    <w:p>
+      <w:pPr>
+        <w:rPr>
+          <w:b/>
+          <w:bCs/>
+        </w:rPr>
+      </w:pPr>
+    </w:p>
+    <w:p>
+      <w:pPr>
+        <w:rPr>
+          <w:b/>
+          <w:bCs/>
+        </w:rPr>
+      </w:pPr>
+    </w:p>
+    <w:p>
+      <w:pPr>
+        <w:rPr>
+          <w:b/>
+          <w:bCs/>
+        </w:rPr>
+      </w:pPr>
+    </w:p>
+    <w:p>
+      <w:pPr>
+        <w:rPr>
+          <w:b/>
+          <w:bCs/>
+        </w:rPr>
+      </w:pPr>
+    </w:p>
+    <w:p>
+      <w:pPr>
+        <w:rPr>
+          <w:b/>
+          <w:bCs/>
+        </w:rPr>
+      </w:pPr>
+    </w:p>
+    <w:p>
+      <w:pPr>
+        <w:rPr>
+          <w:b/>
+          <w:bCs/>
+        </w:rPr>
+      </w:pPr>
+    </w:p>
+    <w:p>
+      <w:pPr>
+        <w:rPr>
+          <w:b/>
+          <w:bCs/>
+        </w:rPr>
+      </w:pPr>
+    </w:p>
+    <w:p>
+      <w:pPr>
+        <w:rPr>
+          <w:b/>
+          <w:bCs/>
+        </w:rPr>
+      </w:pPr>
+    </w:p>
+    <w:p>
+      <w:pPr>
+        <w:rPr>
+          <w:b/>
+          <w:bCs/>
+        </w:rPr>
+      </w:pPr>
+    </w:p>
+    <w:p>
+      <w:pPr>
+        <w:rPr>
+          <w:b/>
+          <w:bCs/>
+        </w:rPr>
+      </w:pPr>
+    </w:p>
+    <w:p>
+      <w:pPr>
+        <w:rPr>
+          <w:b/>
+          <w:bCs/>
+        </w:rPr>
+      </w:pPr>
+    </w:p>
+    <w:p>
+      <w:pPr>
+        <w:rPr>
+          <w:b/>
+          <w:bCs/>
+        </w:rPr>
+      </w:pPr>
+    </w:p>
+    <w:p>
+      <w:pPr>
+        <w:rPr>
+          <w:b/>
+          <w:bCs/>
+        </w:rPr>
+      </w:pPr>
+    </w:p>
+    <w:p>
+      <w:pPr>
+        <w:rPr>
+          <w:b/>
+          <w:bCs/>
+        </w:rPr>
+      </w:pPr>
+    </w:p>
+    <w:p>
       <w:r>
         <w:rPr>
           <w:b/>
           <w:bCs/>
         </w:rPr>
+        <w:lastRenderedPageBreak/>
         <w:t>Table: </w:t>
       </w:r>
       <w:proofErr w:type="spellStart"/>
@@ -3608,6 +3729,134 @@
       </w:pPr>
     </w:p>
     <w:p>
+      <w:pPr>
+        <w:rPr>
+          <w:b/>
+          <w:bCs/>
+        </w:rPr>
+      </w:pPr>
+    </w:p>
+    <w:p>
+      <w:pPr>
+        <w:rPr>
+          <w:b/>
+          <w:bCs/>
+        </w:rPr>
+      </w:pPr>
+    </w:p>
+    <w:p>
+      <w:pPr>
+        <w:rPr>
+          <w:b/>
+          <w:bCs/>
+        </w:rPr>
+      </w:pPr>
+    </w:p>
+    <w:p>
+      <w:pPr>
+        <w:rPr>
+          <w:b/>
+          <w:bCs/>
+        </w:rPr>
+      </w:pPr>
+    </w:p>
+    <w:p>
+      <w:pPr>
+        <w:rPr>
+          <w:b/>
+          <w:bCs/>
+        </w:rPr>
+      </w:pPr>
+    </w:p>
+    <w:p>
+      <w:pPr>
+        <w:rPr>
+          <w:b/>
+          <w:bCs/>
+        </w:rPr>
+      </w:pPr>
+    </w:p>
+    <w:p>
+      <w:pPr>
+        <w:rPr>
+          <w:b/>
+          <w:bCs/>
+        </w:rPr>
+      </w:pPr>
+    </w:p>
+    <w:p>
+      <w:pPr>
+        <w:rPr>
+          <w:b/>
+          <w:bCs/>
+        </w:rPr>
+      </w:pPr>
+    </w:p>
+    <w:p>
+      <w:pPr>
+        <w:rPr>
+          <w:b/>
+          <w:bCs/>
+        </w:rPr>
+      </w:pPr>
+    </w:p>
+    <w:p>
+      <w:pPr>
+        <w:rPr>
+          <w:b/>
+          <w:bCs/>
+        </w:rPr>
+      </w:pPr>
+    </w:p>
+    <w:p>
+      <w:pPr>
+        <w:rPr>
+          <w:b/>
+          <w:bCs/>
+        </w:rPr>
+      </w:pPr>
+    </w:p>
+    <w:p>
+      <w:pPr>
+        <w:rPr>
+          <w:b/>
+          <w:bCs/>
+        </w:rPr>
+      </w:pPr>
+    </w:p>
+    <w:p>
+      <w:pPr>
+        <w:rPr>
+          <w:b/>
+          <w:bCs/>
+        </w:rPr>
+      </w:pPr>
+    </w:p>
+    <w:p>
+      <w:pPr>
+        <w:rPr>
+          <w:b/>
+          <w:bCs/>
+        </w:rPr>
+      </w:pPr>
+    </w:p>
+    <w:p>
+      <w:pPr>
+        <w:rPr>
+          <w:b/>
+          <w:bCs/>
+        </w:rPr>
+      </w:pPr>
+    </w:p>
+    <w:p>
+      <w:pPr>
+        <w:rPr>
+          <w:b/>
+          <w:bCs/>
+        </w:rPr>
+      </w:pPr>
+    </w:p>
+    <w:p>
       <w:r>
         <w:rPr>
           <w:b/>
@@ -8583,23 +8832,7 @@
           <w:b/>
           <w:bCs/>
         </w:rPr>
-        <w:t xml:space="preserve"> </w:t>
-      </w:r>
-      <w:proofErr w:type="gramStart"/>
-      <w:r>
-        <w:rPr>
-          <w:b/>
-          <w:bCs/>
-        </w:rPr>
-        <w:t>( IF</w:t>
-      </w:r>
-      <w:proofErr w:type="gramEnd"/>
-      <w:r>
-        <w:rPr>
-          <w:b/>
-          <w:bCs/>
-        </w:rPr>
-        <w:t xml:space="preserve"> API AVAILABLE)</w:t>
+        <w:t xml:space="preserve"> ( IF API AVAILABLE)</w:t>
       </w:r>
     </w:p>
     <w:tbl>
@@ -9326,11 +9559,172 @@
     </w:tbl>
     <w:p/>
     <w:p>
+      <w:pPr>
+        <w:rPr>
+          <w:b/>
+          <w:bCs/>
+        </w:rPr>
+      </w:pPr>
+    </w:p>
+    <w:p>
+      <w:pPr>
+        <w:rPr>
+          <w:b/>
+          <w:bCs/>
+        </w:rPr>
+      </w:pPr>
+    </w:p>
+    <w:p>
+      <w:pPr>
+        <w:rPr>
+          <w:b/>
+          <w:bCs/>
+        </w:rPr>
+      </w:pPr>
+    </w:p>
+    <w:p>
+      <w:pPr>
+        <w:rPr>
+          <w:b/>
+          <w:bCs/>
+        </w:rPr>
+      </w:pPr>
+    </w:p>
+    <w:p>
+      <w:pPr>
+        <w:rPr>
+          <w:b/>
+          <w:bCs/>
+        </w:rPr>
+      </w:pPr>
+    </w:p>
+    <w:p>
+      <w:pPr>
+        <w:rPr>
+          <w:b/>
+          <w:bCs/>
+        </w:rPr>
+      </w:pPr>
+    </w:p>
+    <w:p>
+      <w:pPr>
+        <w:rPr>
+          <w:b/>
+          <w:bCs/>
+        </w:rPr>
+      </w:pPr>
+    </w:p>
+    <w:p>
+      <w:pPr>
+        <w:rPr>
+          <w:b/>
+          <w:bCs/>
+        </w:rPr>
+      </w:pPr>
+    </w:p>
+    <w:p>
+      <w:pPr>
+        <w:rPr>
+          <w:b/>
+          <w:bCs/>
+        </w:rPr>
+      </w:pPr>
+    </w:p>
+    <w:p>
+      <w:pPr>
+        <w:rPr>
+          <w:b/>
+          <w:bCs/>
+        </w:rPr>
+      </w:pPr>
+    </w:p>
+    <w:p>
+      <w:pPr>
+        <w:rPr>
+          <w:b/>
+          <w:bCs/>
+        </w:rPr>
+      </w:pPr>
+    </w:p>
+    <w:p>
+      <w:pPr>
+        <w:rPr>
+          <w:b/>
+          <w:bCs/>
+        </w:rPr>
+      </w:pPr>
+    </w:p>
+    <w:p>
+      <w:pPr>
+        <w:rPr>
+          <w:b/>
+          <w:bCs/>
+        </w:rPr>
+      </w:pPr>
+    </w:p>
+    <w:p>
+      <w:pPr>
+        <w:rPr>
+          <w:b/>
+          <w:bCs/>
+        </w:rPr>
+      </w:pPr>
+    </w:p>
+    <w:p>
+      <w:pPr>
+        <w:rPr>
+          <w:b/>
+          <w:bCs/>
+        </w:rPr>
+      </w:pPr>
+    </w:p>
+    <w:p>
+      <w:pPr>
+        <w:rPr>
+          <w:b/>
+          <w:bCs/>
+        </w:rPr>
+      </w:pPr>
+    </w:p>
+    <w:p>
+      <w:pPr>
+        <w:rPr>
+          <w:b/>
+          <w:bCs/>
+        </w:rPr>
+      </w:pPr>
+    </w:p>
+    <w:p>
+      <w:pPr>
+        <w:rPr>
+          <w:b/>
+          <w:bCs/>
+        </w:rPr>
+      </w:pPr>
+    </w:p>
+    <w:p>
+      <w:pPr>
+        <w:rPr>
+          <w:b/>
+          <w:bCs/>
+        </w:rPr>
+      </w:pPr>
+    </w:p>
+    <w:p>
+      <w:pPr>
+        <w:rPr>
+          <w:b/>
+          <w:bCs/>
+        </w:rPr>
+      </w:pPr>
+    </w:p>
+    <w:p>
       <w:r>
         <w:rPr>
           <w:b/>
           <w:bCs/>
         </w:rPr>
+        <w:lastRenderedPageBreak/>
         <w:t>Table: promotions</w:t>
       </w:r>
     </w:p>
@@ -10446,6 +10840,94 @@
     <w:p/>
     <w:p/>
     <w:p>
+      <w:pPr>
+        <w:rPr>
+          <w:b/>
+          <w:bCs/>
+        </w:rPr>
+      </w:pPr>
+    </w:p>
+    <w:p>
+      <w:pPr>
+        <w:rPr>
+          <w:b/>
+          <w:bCs/>
+        </w:rPr>
+      </w:pPr>
+    </w:p>
+    <w:p>
+      <w:pPr>
+        <w:rPr>
+          <w:b/>
+          <w:bCs/>
+        </w:rPr>
+      </w:pPr>
+    </w:p>
+    <w:p>
+      <w:pPr>
+        <w:rPr>
+          <w:b/>
+          <w:bCs/>
+        </w:rPr>
+      </w:pPr>
+    </w:p>
+    <w:p>
+      <w:pPr>
+        <w:rPr>
+          <w:b/>
+          <w:bCs/>
+        </w:rPr>
+      </w:pPr>
+    </w:p>
+    <w:p>
+      <w:pPr>
+        <w:rPr>
+          <w:b/>
+          <w:bCs/>
+        </w:rPr>
+      </w:pPr>
+    </w:p>
+    <w:p>
+      <w:pPr>
+        <w:rPr>
+          <w:b/>
+          <w:bCs/>
+        </w:rPr>
+      </w:pPr>
+    </w:p>
+    <w:p>
+      <w:pPr>
+        <w:rPr>
+          <w:b/>
+          <w:bCs/>
+        </w:rPr>
+      </w:pPr>
+    </w:p>
+    <w:p>
+      <w:pPr>
+        <w:rPr>
+          <w:b/>
+          <w:bCs/>
+        </w:rPr>
+      </w:pPr>
+    </w:p>
+    <w:p>
+      <w:pPr>
+        <w:rPr>
+          <w:b/>
+          <w:bCs/>
+        </w:rPr>
+      </w:pPr>
+    </w:p>
+    <w:p>
+      <w:pPr>
+        <w:rPr>
+          <w:b/>
+          <w:bCs/>
+        </w:rPr>
+      </w:pPr>
+    </w:p>
+    <w:p>
       <w:r>
         <w:rPr>
           <w:b/>
@@ -11689,11 +12171,124 @@
     </w:tbl>
     <w:p/>
     <w:p>
+      <w:pPr>
+        <w:rPr>
+          <w:b/>
+          <w:bCs/>
+        </w:rPr>
+      </w:pPr>
+    </w:p>
+    <w:p>
+      <w:pPr>
+        <w:rPr>
+          <w:b/>
+          <w:bCs/>
+        </w:rPr>
+      </w:pPr>
+    </w:p>
+    <w:p>
+      <w:pPr>
+        <w:rPr>
+          <w:b/>
+          <w:bCs/>
+        </w:rPr>
+      </w:pPr>
+    </w:p>
+    <w:p>
+      <w:pPr>
+        <w:rPr>
+          <w:b/>
+          <w:bCs/>
+        </w:rPr>
+      </w:pPr>
+    </w:p>
+    <w:p>
+      <w:pPr>
+        <w:rPr>
+          <w:b/>
+          <w:bCs/>
+        </w:rPr>
+      </w:pPr>
+    </w:p>
+    <w:p>
+      <w:pPr>
+        <w:rPr>
+          <w:b/>
+          <w:bCs/>
+        </w:rPr>
+      </w:pPr>
+    </w:p>
+    <w:p>
+      <w:pPr>
+        <w:rPr>
+          <w:b/>
+          <w:bCs/>
+        </w:rPr>
+      </w:pPr>
+    </w:p>
+    <w:p>
+      <w:pPr>
+        <w:rPr>
+          <w:b/>
+          <w:bCs/>
+        </w:rPr>
+      </w:pPr>
+    </w:p>
+    <w:p>
+      <w:pPr>
+        <w:rPr>
+          <w:b/>
+          <w:bCs/>
+        </w:rPr>
+      </w:pPr>
+    </w:p>
+    <w:p>
+      <w:pPr>
+        <w:rPr>
+          <w:b/>
+          <w:bCs/>
+        </w:rPr>
+      </w:pPr>
+    </w:p>
+    <w:p>
+      <w:pPr>
+        <w:rPr>
+          <w:b/>
+          <w:bCs/>
+        </w:rPr>
+      </w:pPr>
+    </w:p>
+    <w:p>
+      <w:pPr>
+        <w:rPr>
+          <w:b/>
+          <w:bCs/>
+        </w:rPr>
+      </w:pPr>
+    </w:p>
+    <w:p>
+      <w:pPr>
+        <w:rPr>
+          <w:b/>
+          <w:bCs/>
+        </w:rPr>
+      </w:pPr>
+    </w:p>
+    <w:p>
+      <w:pPr>
+        <w:rPr>
+          <w:b/>
+          <w:bCs/>
+        </w:rPr>
+      </w:pPr>
+    </w:p>
+    <w:p>
       <w:r>
         <w:rPr>
           <w:b/>
           <w:bCs/>
         </w:rPr>
+        <w:lastRenderedPageBreak/>
         <w:t>Table: users</w:t>
       </w:r>
     </w:p>
@@ -12700,7 +13295,6 @@
           </w:tcPr>
           <w:p>
             <w:r>
-              <w:lastRenderedPageBreak/>
               <w:t>status</w:t>
             </w:r>
           </w:p>
@@ -13339,12 +13933,19 @@
       </w:tr>
     </w:tbl>
     <w:p/>
+    <w:p/>
+    <w:p/>
+    <w:p/>
+    <w:p/>
+    <w:p/>
+    <w:p/>
     <w:p>
       <w:r>
         <w:rPr>
           <w:b/>
           <w:bCs/>
         </w:rPr>
+        <w:lastRenderedPageBreak/>
         <w:t>Table: payments</w:t>
       </w:r>
     </w:p>
@@ -14458,6 +15059,19 @@
     <w:p/>
     <w:p/>
     <w:p/>
+    <w:p/>
+    <w:p/>
+    <w:p/>
+    <w:p/>
+    <w:p/>
+    <w:p/>
+    <w:p/>
+    <w:p/>
+    <w:p/>
+    <w:p/>
+    <w:p/>
+    <w:p/>
+    <w:p/>
     <w:p>
       <w:r>
         <w:rPr>
@@ -14481,23 +15095,7 @@
           <w:b/>
           <w:bCs/>
         </w:rPr>
-        <w:t xml:space="preserve"> </w:t>
-      </w:r>
-      <w:proofErr w:type="gramStart"/>
-      <w:r>
-        <w:rPr>
-          <w:b/>
-          <w:bCs/>
-        </w:rPr>
-        <w:t>( IF</w:t>
-      </w:r>
-      <w:proofErr w:type="gramEnd"/>
-      <w:r>
-        <w:rPr>
-          <w:b/>
-          <w:bCs/>
-        </w:rPr>
-        <w:t xml:space="preserve"> API AVAILABLE)</w:t>
+        <w:t xml:space="preserve"> ( IF API AVAILABLE)</w:t>
       </w:r>
     </w:p>
     <w:tbl>
@@ -15095,11 +15693,196 @@
     </w:tbl>
     <w:p/>
     <w:p>
+      <w:pPr>
+        <w:rPr>
+          <w:b/>
+          <w:bCs/>
+        </w:rPr>
+      </w:pPr>
+    </w:p>
+    <w:p>
+      <w:pPr>
+        <w:rPr>
+          <w:b/>
+          <w:bCs/>
+        </w:rPr>
+      </w:pPr>
+    </w:p>
+    <w:p>
+      <w:pPr>
+        <w:rPr>
+          <w:b/>
+          <w:bCs/>
+        </w:rPr>
+      </w:pPr>
+    </w:p>
+    <w:p>
+      <w:pPr>
+        <w:rPr>
+          <w:b/>
+          <w:bCs/>
+        </w:rPr>
+      </w:pPr>
+    </w:p>
+    <w:p>
+      <w:pPr>
+        <w:rPr>
+          <w:b/>
+          <w:bCs/>
+        </w:rPr>
+      </w:pPr>
+    </w:p>
+    <w:p>
+      <w:pPr>
+        <w:rPr>
+          <w:b/>
+          <w:bCs/>
+        </w:rPr>
+      </w:pPr>
+    </w:p>
+    <w:p>
+      <w:pPr>
+        <w:rPr>
+          <w:b/>
+          <w:bCs/>
+        </w:rPr>
+      </w:pPr>
+    </w:p>
+    <w:p>
+      <w:pPr>
+        <w:rPr>
+          <w:b/>
+          <w:bCs/>
+        </w:rPr>
+      </w:pPr>
+    </w:p>
+    <w:p>
+      <w:pPr>
+        <w:rPr>
+          <w:b/>
+          <w:bCs/>
+        </w:rPr>
+      </w:pPr>
+    </w:p>
+    <w:p>
+      <w:pPr>
+        <w:rPr>
+          <w:b/>
+          <w:bCs/>
+        </w:rPr>
+      </w:pPr>
+    </w:p>
+    <w:p>
+      <w:pPr>
+        <w:rPr>
+          <w:b/>
+          <w:bCs/>
+        </w:rPr>
+      </w:pPr>
+    </w:p>
+    <w:p>
+      <w:pPr>
+        <w:rPr>
+          <w:b/>
+          <w:bCs/>
+        </w:rPr>
+      </w:pPr>
+    </w:p>
+    <w:p>
+      <w:pPr>
+        <w:rPr>
+          <w:b/>
+          <w:bCs/>
+        </w:rPr>
+      </w:pPr>
+    </w:p>
+    <w:p>
+      <w:pPr>
+        <w:rPr>
+          <w:b/>
+          <w:bCs/>
+        </w:rPr>
+      </w:pPr>
+    </w:p>
+    <w:p>
+      <w:pPr>
+        <w:rPr>
+          <w:b/>
+          <w:bCs/>
+        </w:rPr>
+      </w:pPr>
+    </w:p>
+    <w:p>
+      <w:pPr>
+        <w:rPr>
+          <w:b/>
+          <w:bCs/>
+        </w:rPr>
+      </w:pPr>
+    </w:p>
+    <w:p>
+      <w:pPr>
+        <w:rPr>
+          <w:b/>
+          <w:bCs/>
+        </w:rPr>
+      </w:pPr>
+    </w:p>
+    <w:p>
+      <w:pPr>
+        <w:rPr>
+          <w:b/>
+          <w:bCs/>
+        </w:rPr>
+      </w:pPr>
+    </w:p>
+    <w:p>
+      <w:pPr>
+        <w:rPr>
+          <w:b/>
+          <w:bCs/>
+        </w:rPr>
+      </w:pPr>
+    </w:p>
+    <w:p>
+      <w:pPr>
+        <w:rPr>
+          <w:b/>
+          <w:bCs/>
+        </w:rPr>
+      </w:pPr>
+    </w:p>
+    <w:p>
+      <w:pPr>
+        <w:rPr>
+          <w:b/>
+          <w:bCs/>
+        </w:rPr>
+      </w:pPr>
+    </w:p>
+    <w:p>
+      <w:pPr>
+        <w:rPr>
+          <w:b/>
+          <w:bCs/>
+        </w:rPr>
+      </w:pPr>
+    </w:p>
+    <w:p>
+      <w:pPr>
+        <w:rPr>
+          <w:b/>
+          <w:bCs/>
+        </w:rPr>
+      </w:pPr>
+    </w:p>
+    <w:p>
       <w:r>
         <w:rPr>
           <w:b/>
           <w:bCs/>
         </w:rPr>
+        <w:lastRenderedPageBreak/>
         <w:t>Table: </w:t>
       </w:r>
       <w:proofErr w:type="spellStart"/>
@@ -15116,23 +15899,7 @@
           <w:b/>
           <w:bCs/>
         </w:rPr>
-        <w:t xml:space="preserve"> </w:t>
-      </w:r>
-      <w:proofErr w:type="gramStart"/>
-      <w:r>
-        <w:rPr>
-          <w:b/>
-          <w:bCs/>
-        </w:rPr>
-        <w:t>( IF</w:t>
-      </w:r>
-      <w:proofErr w:type="gramEnd"/>
-      <w:r>
-        <w:rPr>
-          <w:b/>
-          <w:bCs/>
-        </w:rPr>
-        <w:t xml:space="preserve"> API AVAILABLE)</w:t>
+        <w:t xml:space="preserve"> ( IF API AVAILABLE)</w:t>
       </w:r>
     </w:p>
     <w:tbl>
@@ -15984,11 +16751,156 @@
     </w:tbl>
     <w:p/>
     <w:p>
+      <w:pPr>
+        <w:rPr>
+          <w:b/>
+          <w:bCs/>
+        </w:rPr>
+      </w:pPr>
+    </w:p>
+    <w:p>
+      <w:pPr>
+        <w:rPr>
+          <w:b/>
+          <w:bCs/>
+        </w:rPr>
+      </w:pPr>
+    </w:p>
+    <w:p>
+      <w:pPr>
+        <w:rPr>
+          <w:b/>
+          <w:bCs/>
+        </w:rPr>
+      </w:pPr>
+    </w:p>
+    <w:p>
+      <w:pPr>
+        <w:rPr>
+          <w:b/>
+          <w:bCs/>
+        </w:rPr>
+      </w:pPr>
+    </w:p>
+    <w:p>
+      <w:pPr>
+        <w:rPr>
+          <w:b/>
+          <w:bCs/>
+        </w:rPr>
+      </w:pPr>
+    </w:p>
+    <w:p>
+      <w:pPr>
+        <w:rPr>
+          <w:b/>
+          <w:bCs/>
+        </w:rPr>
+      </w:pPr>
+    </w:p>
+    <w:p>
+      <w:pPr>
+        <w:rPr>
+          <w:b/>
+          <w:bCs/>
+        </w:rPr>
+      </w:pPr>
+    </w:p>
+    <w:p>
+      <w:pPr>
+        <w:rPr>
+          <w:b/>
+          <w:bCs/>
+        </w:rPr>
+      </w:pPr>
+    </w:p>
+    <w:p>
+      <w:pPr>
+        <w:rPr>
+          <w:b/>
+          <w:bCs/>
+        </w:rPr>
+      </w:pPr>
+    </w:p>
+    <w:p>
+      <w:pPr>
+        <w:rPr>
+          <w:b/>
+          <w:bCs/>
+        </w:rPr>
+      </w:pPr>
+    </w:p>
+    <w:p>
+      <w:pPr>
+        <w:rPr>
+          <w:b/>
+          <w:bCs/>
+        </w:rPr>
+      </w:pPr>
+    </w:p>
+    <w:p>
+      <w:pPr>
+        <w:rPr>
+          <w:b/>
+          <w:bCs/>
+        </w:rPr>
+      </w:pPr>
+    </w:p>
+    <w:p>
+      <w:pPr>
+        <w:rPr>
+          <w:b/>
+          <w:bCs/>
+        </w:rPr>
+      </w:pPr>
+    </w:p>
+    <w:p>
+      <w:pPr>
+        <w:rPr>
+          <w:b/>
+          <w:bCs/>
+        </w:rPr>
+      </w:pPr>
+    </w:p>
+    <w:p>
+      <w:pPr>
+        <w:rPr>
+          <w:b/>
+          <w:bCs/>
+        </w:rPr>
+      </w:pPr>
+    </w:p>
+    <w:p>
+      <w:pPr>
+        <w:rPr>
+          <w:b/>
+          <w:bCs/>
+        </w:rPr>
+      </w:pPr>
+    </w:p>
+    <w:p>
+      <w:pPr>
+        <w:rPr>
+          <w:b/>
+          <w:bCs/>
+        </w:rPr>
+      </w:pPr>
+    </w:p>
+    <w:p>
+      <w:pPr>
+        <w:rPr>
+          <w:b/>
+          <w:bCs/>
+        </w:rPr>
+      </w:pPr>
+    </w:p>
+    <w:p>
       <w:r>
         <w:rPr>
           <w:b/>
           <w:bCs/>
         </w:rPr>
+        <w:lastRenderedPageBreak/>
         <w:t>Table: </w:t>
       </w:r>
       <w:proofErr w:type="spellStart"/>
@@ -16005,23 +16917,7 @@
           <w:b/>
           <w:bCs/>
         </w:rPr>
-        <w:t xml:space="preserve"> </w:t>
-      </w:r>
-      <w:proofErr w:type="gramStart"/>
-      <w:r>
-        <w:rPr>
-          <w:b/>
-          <w:bCs/>
-        </w:rPr>
-        <w:t>( IF</w:t>
-      </w:r>
-      <w:proofErr w:type="gramEnd"/>
-      <w:r>
-        <w:rPr>
-          <w:b/>
-          <w:bCs/>
-        </w:rPr>
-        <w:t xml:space="preserve"> API AVAILABLE)</w:t>
+        <w:t xml:space="preserve"> ( IF API AVAILABLE)</w:t>
       </w:r>
     </w:p>
     <w:tbl>
@@ -16763,7 +17659,6 @@
           </w:tcPr>
           <w:p>
             <w:r>
-              <w:lastRenderedPageBreak/>
               <w:t>status</w:t>
             </w:r>
           </w:p>
@@ -17130,11 +18025,132 @@
     </w:tbl>
     <w:p/>
     <w:p>
+      <w:pPr>
+        <w:rPr>
+          <w:b/>
+          <w:bCs/>
+        </w:rPr>
+      </w:pPr>
+    </w:p>
+    <w:p>
+      <w:pPr>
+        <w:rPr>
+          <w:b/>
+          <w:bCs/>
+        </w:rPr>
+      </w:pPr>
+    </w:p>
+    <w:p>
+      <w:pPr>
+        <w:rPr>
+          <w:b/>
+          <w:bCs/>
+        </w:rPr>
+      </w:pPr>
+    </w:p>
+    <w:p>
+      <w:pPr>
+        <w:rPr>
+          <w:b/>
+          <w:bCs/>
+        </w:rPr>
+      </w:pPr>
+    </w:p>
+    <w:p>
+      <w:pPr>
+        <w:rPr>
+          <w:b/>
+          <w:bCs/>
+        </w:rPr>
+      </w:pPr>
+    </w:p>
+    <w:p>
+      <w:pPr>
+        <w:rPr>
+          <w:b/>
+          <w:bCs/>
+        </w:rPr>
+      </w:pPr>
+    </w:p>
+    <w:p>
+      <w:pPr>
+        <w:rPr>
+          <w:b/>
+          <w:bCs/>
+        </w:rPr>
+      </w:pPr>
+    </w:p>
+    <w:p>
+      <w:pPr>
+        <w:rPr>
+          <w:b/>
+          <w:bCs/>
+        </w:rPr>
+      </w:pPr>
+    </w:p>
+    <w:p>
+      <w:pPr>
+        <w:rPr>
+          <w:b/>
+          <w:bCs/>
+        </w:rPr>
+      </w:pPr>
+    </w:p>
+    <w:p>
+      <w:pPr>
+        <w:rPr>
+          <w:b/>
+          <w:bCs/>
+        </w:rPr>
+      </w:pPr>
+    </w:p>
+    <w:p>
+      <w:pPr>
+        <w:rPr>
+          <w:b/>
+          <w:bCs/>
+        </w:rPr>
+      </w:pPr>
+    </w:p>
+    <w:p>
+      <w:pPr>
+        <w:rPr>
+          <w:b/>
+          <w:bCs/>
+        </w:rPr>
+      </w:pPr>
+    </w:p>
+    <w:p>
+      <w:pPr>
+        <w:rPr>
+          <w:b/>
+          <w:bCs/>
+        </w:rPr>
+      </w:pPr>
+    </w:p>
+    <w:p>
+      <w:pPr>
+        <w:rPr>
+          <w:b/>
+          <w:bCs/>
+        </w:rPr>
+      </w:pPr>
+    </w:p>
+    <w:p>
+      <w:pPr>
+        <w:rPr>
+          <w:b/>
+          <w:bCs/>
+        </w:rPr>
+      </w:pPr>
+    </w:p>
+    <w:p>
       <w:r>
         <w:rPr>
           <w:b/>
           <w:bCs/>
         </w:rPr>
+        <w:lastRenderedPageBreak/>
         <w:t>Table: </w:t>
       </w:r>
       <w:proofErr w:type="spellStart"/>
@@ -17151,23 +18167,7 @@
           <w:b/>
           <w:bCs/>
         </w:rPr>
-        <w:t xml:space="preserve"> </w:t>
-      </w:r>
-      <w:proofErr w:type="gramStart"/>
-      <w:r>
-        <w:rPr>
-          <w:b/>
-          <w:bCs/>
-        </w:rPr>
-        <w:t>( IF</w:t>
-      </w:r>
-      <w:proofErr w:type="gramEnd"/>
-      <w:r>
-        <w:rPr>
-          <w:b/>
-          <w:bCs/>
-        </w:rPr>
-        <w:t xml:space="preserve"> API AVAILABLE)</w:t>
+        <w:t xml:space="preserve"> ( IF API AVAILABLE)</w:t>
       </w:r>
     </w:p>
     <w:tbl>
@@ -18019,11 +19019,164 @@
     </w:tbl>
     <w:p/>
     <w:p>
+      <w:pPr>
+        <w:rPr>
+          <w:b/>
+          <w:bCs/>
+        </w:rPr>
+      </w:pPr>
+    </w:p>
+    <w:p>
+      <w:pPr>
+        <w:rPr>
+          <w:b/>
+          <w:bCs/>
+        </w:rPr>
+      </w:pPr>
+    </w:p>
+    <w:p>
+      <w:pPr>
+        <w:rPr>
+          <w:b/>
+          <w:bCs/>
+        </w:rPr>
+      </w:pPr>
+    </w:p>
+    <w:p>
+      <w:pPr>
+        <w:rPr>
+          <w:b/>
+          <w:bCs/>
+        </w:rPr>
+      </w:pPr>
+    </w:p>
+    <w:p>
+      <w:pPr>
+        <w:rPr>
+          <w:b/>
+          <w:bCs/>
+        </w:rPr>
+      </w:pPr>
+    </w:p>
+    <w:p>
+      <w:pPr>
+        <w:rPr>
+          <w:b/>
+          <w:bCs/>
+        </w:rPr>
+      </w:pPr>
+    </w:p>
+    <w:p>
+      <w:pPr>
+        <w:rPr>
+          <w:b/>
+          <w:bCs/>
+        </w:rPr>
+      </w:pPr>
+    </w:p>
+    <w:p>
+      <w:pPr>
+        <w:rPr>
+          <w:b/>
+          <w:bCs/>
+        </w:rPr>
+      </w:pPr>
+    </w:p>
+    <w:p>
+      <w:pPr>
+        <w:rPr>
+          <w:b/>
+          <w:bCs/>
+        </w:rPr>
+      </w:pPr>
+    </w:p>
+    <w:p>
+      <w:pPr>
+        <w:rPr>
+          <w:b/>
+          <w:bCs/>
+        </w:rPr>
+      </w:pPr>
+    </w:p>
+    <w:p>
+      <w:pPr>
+        <w:rPr>
+          <w:b/>
+          <w:bCs/>
+        </w:rPr>
+      </w:pPr>
+    </w:p>
+    <w:p>
+      <w:pPr>
+        <w:rPr>
+          <w:b/>
+          <w:bCs/>
+        </w:rPr>
+      </w:pPr>
+    </w:p>
+    <w:p>
+      <w:pPr>
+        <w:rPr>
+          <w:b/>
+          <w:bCs/>
+        </w:rPr>
+      </w:pPr>
+    </w:p>
+    <w:p>
+      <w:pPr>
+        <w:rPr>
+          <w:b/>
+          <w:bCs/>
+        </w:rPr>
+      </w:pPr>
+    </w:p>
+    <w:p>
+      <w:pPr>
+        <w:rPr>
+          <w:b/>
+          <w:bCs/>
+        </w:rPr>
+      </w:pPr>
+    </w:p>
+    <w:p>
+      <w:pPr>
+        <w:rPr>
+          <w:b/>
+          <w:bCs/>
+        </w:rPr>
+      </w:pPr>
+    </w:p>
+    <w:p>
+      <w:pPr>
+        <w:rPr>
+          <w:b/>
+          <w:bCs/>
+        </w:rPr>
+      </w:pPr>
+    </w:p>
+    <w:p>
+      <w:pPr>
+        <w:rPr>
+          <w:b/>
+          <w:bCs/>
+        </w:rPr>
+      </w:pPr>
+    </w:p>
+    <w:p>
+      <w:pPr>
+        <w:rPr>
+          <w:b/>
+          <w:bCs/>
+        </w:rPr>
+      </w:pPr>
+    </w:p>
+    <w:p>
       <w:r>
         <w:rPr>
           <w:b/>
           <w:bCs/>
         </w:rPr>
+        <w:lastRenderedPageBreak/>
         <w:t>Table: languages</w:t>
       </w:r>
       <w:r>
@@ -18032,36 +19185,6 @@
           <w:bCs/>
         </w:rPr>
         <w:t xml:space="preserve"> </w:t>
-      </w:r>
-      <w:proofErr w:type="gramStart"/>
-      <w:r>
-        <w:rPr>
-          <w:b/>
-          <w:bCs/>
-        </w:rPr>
-        <w:t>( IF</w:t>
-      </w:r>
-      <w:proofErr w:type="gramEnd"/>
-      <w:r>
-        <w:rPr>
-          <w:b/>
-          <w:bCs/>
-        </w:rPr>
-        <w:t xml:space="preserve"> API AVAILAB</w:t>
-      </w:r>
-      <w:r>
-        <w:rPr>
-          <w:b/>
-          <w:bCs/>
-        </w:rPr>
-        <w:t>LE</w:t>
-      </w:r>
-      <w:r>
-        <w:rPr>
-          <w:b/>
-          <w:bCs/>
-        </w:rPr>
-        <w:t>)</w:t>
       </w:r>
     </w:p>
     <w:tbl>
@@ -18690,6 +19813,174 @@
       </w:pPr>
     </w:p>
     <w:p>
+      <w:pPr>
+        <w:rPr>
+          <w:b/>
+          <w:bCs/>
+        </w:rPr>
+      </w:pPr>
+    </w:p>
+    <w:p>
+      <w:pPr>
+        <w:rPr>
+          <w:b/>
+          <w:bCs/>
+        </w:rPr>
+      </w:pPr>
+    </w:p>
+    <w:p>
+      <w:pPr>
+        <w:rPr>
+          <w:b/>
+          <w:bCs/>
+        </w:rPr>
+      </w:pPr>
+    </w:p>
+    <w:p>
+      <w:pPr>
+        <w:rPr>
+          <w:b/>
+          <w:bCs/>
+        </w:rPr>
+      </w:pPr>
+    </w:p>
+    <w:p>
+      <w:pPr>
+        <w:rPr>
+          <w:b/>
+          <w:bCs/>
+        </w:rPr>
+      </w:pPr>
+    </w:p>
+    <w:p>
+      <w:pPr>
+        <w:rPr>
+          <w:b/>
+          <w:bCs/>
+        </w:rPr>
+      </w:pPr>
+    </w:p>
+    <w:p>
+      <w:pPr>
+        <w:rPr>
+          <w:b/>
+          <w:bCs/>
+        </w:rPr>
+      </w:pPr>
+    </w:p>
+    <w:p>
+      <w:pPr>
+        <w:rPr>
+          <w:b/>
+          <w:bCs/>
+        </w:rPr>
+      </w:pPr>
+    </w:p>
+    <w:p>
+      <w:pPr>
+        <w:rPr>
+          <w:b/>
+          <w:bCs/>
+        </w:rPr>
+      </w:pPr>
+    </w:p>
+    <w:p>
+      <w:pPr>
+        <w:rPr>
+          <w:b/>
+          <w:bCs/>
+        </w:rPr>
+      </w:pPr>
+    </w:p>
+    <w:p>
+      <w:pPr>
+        <w:rPr>
+          <w:b/>
+          <w:bCs/>
+        </w:rPr>
+      </w:pPr>
+    </w:p>
+    <w:p>
+      <w:pPr>
+        <w:rPr>
+          <w:b/>
+          <w:bCs/>
+        </w:rPr>
+      </w:pPr>
+    </w:p>
+    <w:p>
+      <w:pPr>
+        <w:rPr>
+          <w:b/>
+          <w:bCs/>
+        </w:rPr>
+      </w:pPr>
+    </w:p>
+    <w:p>
+      <w:pPr>
+        <w:rPr>
+          <w:b/>
+          <w:bCs/>
+        </w:rPr>
+      </w:pPr>
+    </w:p>
+    <w:p>
+      <w:pPr>
+        <w:rPr>
+          <w:b/>
+          <w:bCs/>
+        </w:rPr>
+      </w:pPr>
+    </w:p>
+    <w:p>
+      <w:pPr>
+        <w:rPr>
+          <w:b/>
+          <w:bCs/>
+        </w:rPr>
+      </w:pPr>
+    </w:p>
+    <w:p>
+      <w:pPr>
+        <w:rPr>
+          <w:b/>
+          <w:bCs/>
+        </w:rPr>
+      </w:pPr>
+    </w:p>
+    <w:p>
+      <w:pPr>
+        <w:rPr>
+          <w:b/>
+          <w:bCs/>
+        </w:rPr>
+      </w:pPr>
+    </w:p>
+    <w:p>
+      <w:pPr>
+        <w:rPr>
+          <w:b/>
+          <w:bCs/>
+        </w:rPr>
+      </w:pPr>
+    </w:p>
+    <w:p>
+      <w:pPr>
+        <w:rPr>
+          <w:b/>
+          <w:bCs/>
+        </w:rPr>
+      </w:pPr>
+    </w:p>
+    <w:p>
+      <w:pPr>
+        <w:rPr>
+          <w:b/>
+          <w:bCs/>
+        </w:rPr>
+      </w:pPr>
+    </w:p>
+    <w:p>
       <w:r>
         <w:rPr>
           <w:b/>
@@ -18704,13 +19995,6 @@
           <w:bCs/>
         </w:rPr>
         <w:t xml:space="preserve"> </w:t>
-      </w:r>
-      <w:r>
-        <w:rPr>
-          <w:b/>
-          <w:bCs/>
-        </w:rPr>
-        <w:t>( IF API AVAILABLE)</w:t>
       </w:r>
     </w:p>
     <w:tbl>
@@ -19564,11 +20848,164 @@
     </w:tbl>
     <w:p/>
     <w:p>
+      <w:pPr>
+        <w:rPr>
+          <w:b/>
+          <w:bCs/>
+        </w:rPr>
+      </w:pPr>
+    </w:p>
+    <w:p>
+      <w:pPr>
+        <w:rPr>
+          <w:b/>
+          <w:bCs/>
+        </w:rPr>
+      </w:pPr>
+    </w:p>
+    <w:p>
+      <w:pPr>
+        <w:rPr>
+          <w:b/>
+          <w:bCs/>
+        </w:rPr>
+      </w:pPr>
+    </w:p>
+    <w:p>
+      <w:pPr>
+        <w:rPr>
+          <w:b/>
+          <w:bCs/>
+        </w:rPr>
+      </w:pPr>
+    </w:p>
+    <w:p>
+      <w:pPr>
+        <w:rPr>
+          <w:b/>
+          <w:bCs/>
+        </w:rPr>
+      </w:pPr>
+    </w:p>
+    <w:p>
+      <w:pPr>
+        <w:rPr>
+          <w:b/>
+          <w:bCs/>
+        </w:rPr>
+      </w:pPr>
+    </w:p>
+    <w:p>
+      <w:pPr>
+        <w:rPr>
+          <w:b/>
+          <w:bCs/>
+        </w:rPr>
+      </w:pPr>
+    </w:p>
+    <w:p>
+      <w:pPr>
+        <w:rPr>
+          <w:b/>
+          <w:bCs/>
+        </w:rPr>
+      </w:pPr>
+    </w:p>
+    <w:p>
+      <w:pPr>
+        <w:rPr>
+          <w:b/>
+          <w:bCs/>
+        </w:rPr>
+      </w:pPr>
+    </w:p>
+    <w:p>
+      <w:pPr>
+        <w:rPr>
+          <w:b/>
+          <w:bCs/>
+        </w:rPr>
+      </w:pPr>
+    </w:p>
+    <w:p>
+      <w:pPr>
+        <w:rPr>
+          <w:b/>
+          <w:bCs/>
+        </w:rPr>
+      </w:pPr>
+    </w:p>
+    <w:p>
+      <w:pPr>
+        <w:rPr>
+          <w:b/>
+          <w:bCs/>
+        </w:rPr>
+      </w:pPr>
+    </w:p>
+    <w:p>
+      <w:pPr>
+        <w:rPr>
+          <w:b/>
+          <w:bCs/>
+        </w:rPr>
+      </w:pPr>
+    </w:p>
+    <w:p>
+      <w:pPr>
+        <w:rPr>
+          <w:b/>
+          <w:bCs/>
+        </w:rPr>
+      </w:pPr>
+    </w:p>
+    <w:p>
+      <w:pPr>
+        <w:rPr>
+          <w:b/>
+          <w:bCs/>
+        </w:rPr>
+      </w:pPr>
+    </w:p>
+    <w:p>
+      <w:pPr>
+        <w:rPr>
+          <w:b/>
+          <w:bCs/>
+        </w:rPr>
+      </w:pPr>
+    </w:p>
+    <w:p>
+      <w:pPr>
+        <w:rPr>
+          <w:b/>
+          <w:bCs/>
+        </w:rPr>
+      </w:pPr>
+    </w:p>
+    <w:p>
+      <w:pPr>
+        <w:rPr>
+          <w:b/>
+          <w:bCs/>
+        </w:rPr>
+      </w:pPr>
+    </w:p>
+    <w:p>
+      <w:pPr>
+        <w:rPr>
+          <w:b/>
+          <w:bCs/>
+        </w:rPr>
+      </w:pPr>
+    </w:p>
+    <w:p>
       <w:r>
         <w:rPr>
           <w:b/>
           <w:bCs/>
         </w:rPr>
+        <w:lastRenderedPageBreak/>
         <w:t>Table: memberships</w:t>
       </w:r>
     </w:p>
@@ -20551,6 +21988,102 @@
       </w:tr>
     </w:tbl>
     <w:p/>
+    <w:p>
+      <w:pPr>
+        <w:rPr>
+          <w:b/>
+          <w:bCs/>
+        </w:rPr>
+      </w:pPr>
+    </w:p>
+    <w:p>
+      <w:pPr>
+        <w:rPr>
+          <w:b/>
+          <w:bCs/>
+        </w:rPr>
+      </w:pPr>
+    </w:p>
+    <w:p>
+      <w:pPr>
+        <w:rPr>
+          <w:b/>
+          <w:bCs/>
+        </w:rPr>
+      </w:pPr>
+    </w:p>
+    <w:p>
+      <w:pPr>
+        <w:rPr>
+          <w:b/>
+          <w:bCs/>
+        </w:rPr>
+      </w:pPr>
+    </w:p>
+    <w:p>
+      <w:pPr>
+        <w:rPr>
+          <w:b/>
+          <w:bCs/>
+        </w:rPr>
+      </w:pPr>
+    </w:p>
+    <w:p>
+      <w:pPr>
+        <w:rPr>
+          <w:b/>
+          <w:bCs/>
+        </w:rPr>
+      </w:pPr>
+    </w:p>
+    <w:p>
+      <w:pPr>
+        <w:rPr>
+          <w:b/>
+          <w:bCs/>
+        </w:rPr>
+      </w:pPr>
+    </w:p>
+    <w:p>
+      <w:pPr>
+        <w:rPr>
+          <w:b/>
+          <w:bCs/>
+        </w:rPr>
+      </w:pPr>
+    </w:p>
+    <w:p>
+      <w:pPr>
+        <w:rPr>
+          <w:b/>
+          <w:bCs/>
+        </w:rPr>
+      </w:pPr>
+    </w:p>
+    <w:p>
+      <w:pPr>
+        <w:rPr>
+          <w:b/>
+          <w:bCs/>
+        </w:rPr>
+      </w:pPr>
+    </w:p>
+    <w:p>
+      <w:pPr>
+        <w:rPr>
+          <w:b/>
+          <w:bCs/>
+        </w:rPr>
+      </w:pPr>
+    </w:p>
+    <w:p>
+      <w:pPr>
+        <w:rPr>
+          <w:b/>
+          <w:bCs/>
+        </w:rPr>
+      </w:pPr>
+    </w:p>
     <w:p>
       <w:pPr>
         <w:rPr>
@@ -22708,6 +24241,7 @@
   <w:style w:type="character" w:default="1" w:styleId="DefaultParagraphFont">
     <w:name w:val="Default Paragraph Font"/>
     <w:uiPriority w:val="1"/>
+    <w:semiHidden/>
     <w:unhideWhenUsed/>
   </w:style>
   <w:style w:type="table" w:default="1" w:styleId="TableNormal">

</xml_diff>